<commit_message>
docs: add ranking bar charts to aster-code-dashboard scope listing
Section 3 (Scope) now explicitly lists the 2 code ranking bar charts
(Volume by Code, Fees by Code) as separate line items alongside the
6 time-series and 3 analysis charts. Total: 11 charts.

Co-Authored-By: Claude Opus 4.6 (1M context) <noreply@anthropic.com>
</commit_message>
<xml_diff>
--- a/docs/aster-code-dashboard-prd.docx
+++ b/docs/aster-code-dashboard-prd.docx
@@ -305,6 +305,14 @@
       </w:pPr>
       <w:r>
         <w:t>6 time-series charts: Aster Code Volume (overall), Volume proportion, Volume by code, Fees by code, Cumulative users by code, User proportion</w:t>
+      </w:r>
+    </w:p>
+    <w:p>
+      <w:pPr>
+        <w:pStyle w:val="ListBullet"/>
+      </w:pPr>
+      <w:r>
+        <w:t>2 code ranking bar charts: Volume by Code (descending bars + cumulative line), Fees by Code (descending bars + cumulative line)</w:t>
       </w:r>
     </w:p>
     <w:p>

</xml_diff>

<commit_message>
docs: add mobile H5 responsive layout to aster-code-dashboard scope
Move mobile-responsive from out-of-scope to in-scope v1. Add Section
6.6 with detailed mobile H5 requirements: responsive breakpoints
(desktop/tablet/mobile), stacked KPI cards, single-column charts,
collapsible legends, sticky table columns, touch gestures. Update
browser support NFR to include Safari iOS and Chrome Android.

Co-Authored-By: Claude Opus 4.6 (1M context) <noreply@anthropic.com>
</commit_message>
<xml_diff>
--- a/docs/aster-code-dashboard-prd.docx
+++ b/docs/aster-code-dashboard-prd.docx
@@ -376,7 +376,7 @@
         <w:pStyle w:val="ListBullet"/>
       </w:pPr>
       <w:r>
-        <w:t>Responsive layout for desktop browsers (mobile-responsive is v2)</w:t>
+        <w:t>Responsive layout for desktop and mobile H5 browsers (breakpoints: desktop &gt;= 1280px, tablet 768-1279px, mobile &lt; 768px)</w:t>
       </w:r>
     </w:p>
     <w:p>
@@ -393,14 +393,6 @@
       </w:pPr>
       <w:r>
         <w:t>Out of Scope (v2+)</w:t>
-      </w:r>
-    </w:p>
-    <w:p>
-      <w:pPr>
-        <w:pStyle w:val="ListBullet"/>
-      </w:pPr>
-      <w:r>
-        <w:t>Mobile-responsive layout -- v1 targets desktop; v2 adds mobile breakpoints and potential React Native integration</w:t>
       </w:r>
     </w:p>
     <w:p>
@@ -2051,7 +2043,95 @@
         <w:pStyle w:val="Heading2"/>
       </w:pPr>
       <w:r>
-        <w:t>6.6 Data Pipeline</w:t>
+        <w:t>6.6 Mobile H5 Responsive Layout</w:t>
+      </w:r>
+    </w:p>
+    <w:p>
+      <w:pPr>
+        <w:pStyle w:val="ListBullet"/>
+      </w:pPr>
+      <w:r>
+        <w:t>The dashboard must be fully functional on mobile H5 browsers (Safari, Chrome mobile) with responsive breakpoints: desktop &gt;= 1280px, tablet 768-1279px, mobile &lt; 768px.</w:t>
+      </w:r>
+    </w:p>
+    <w:p>
+      <w:pPr>
+        <w:pStyle w:val="ListBullet"/>
+      </w:pPr>
+      <w:r>
+        <w:t>KPI cards: stack vertically on mobile (1 column), side-by-side on tablet (3 columns).</w:t>
+      </w:r>
+    </w:p>
+    <w:p>
+      <w:pPr>
+        <w:pStyle w:val="ListBullet"/>
+      </w:pPr>
+      <w:r>
+        <w:t>Chart grid: switch from 2-column to 1-column layout on mobile. Charts must maintain minimum height of 280px on mobile for readability.</w:t>
+      </w:r>
+    </w:p>
+    <w:p>
+      <w:pPr>
+        <w:pStyle w:val="ListBullet"/>
+      </w:pPr>
+      <w:r>
+        <w:t>Time range and chart type toggles: remain accessible on mobile. Use compact toggle buttons (not dropdowns).</w:t>
+      </w:r>
+    </w:p>
+    <w:p>
+      <w:pPr>
+        <w:pStyle w:val="ListBullet"/>
+      </w:pPr>
+      <w:r>
+        <w:t>Chart legends: collapsible on mobile to save vertical space. Default collapsed, tap to expand.</w:t>
+      </w:r>
+    </w:p>
+    <w:p>
+      <w:pPr>
+        <w:pStyle w:val="ListBullet"/>
+      </w:pPr>
+      <w:r>
+        <w:t>Pie chart: reduce label density on mobile; show top 5 segments with labels, rest grouped as 'Others'.</w:t>
+      </w:r>
+    </w:p>
+    <w:p>
+      <w:pPr>
+        <w:pStyle w:val="ListBullet"/>
+      </w:pPr>
+      <w:r>
+        <w:t>Stats table: horizontally scrollable on mobile. Code name and Volume columns remain sticky (fixed left) during horizontal scroll.</w:t>
+      </w:r>
+    </w:p>
+    <w:p>
+      <w:pPr>
+        <w:pStyle w:val="ListBullet"/>
+      </w:pPr>
+      <w:r>
+        <w:t>Table pagination: use simplified pagination on mobile (previous / next only, no page numbers).</w:t>
+      </w:r>
+    </w:p>
+    <w:p>
+      <w:pPr>
+        <w:pStyle w:val="ListBullet"/>
+      </w:pPr>
+      <w:r>
+        <w:t>Copy address button: increase tap target to minimum 44x44dp on mobile for accessibility.</w:t>
+      </w:r>
+    </w:p>
+    <w:p>
+      <w:pPr>
+        <w:pStyle w:val="ListBullet"/>
+      </w:pPr>
+      <w:r>
+        <w:t>Touch interactions: support swipe gestures for chart scrolling on mobile. Disable hover-dependent interactions (tooltips trigger on tap instead).</w:t>
+      </w:r>
+    </w:p>
+    <w:p>
+      <w:pPr>
+        <w:pStyle w:val="Heading2"/>
+      </w:pPr>
+      <w:r>
+        <w:t>6.7 Data Pipeline</w:t>
       </w:r>
     </w:p>
     <w:p>
@@ -5624,7 +5704,7 @@
           </w:tcPr>
           <w:p>
             <w:r>
-              <w:t>Chrome, Firefox, Safari, Edge (latest 2 versions). Mobile browser support deferred to v2.</w:t>
+              <w:t>Desktop: Chrome, Firefox, Safari, Edge (latest 2 versions). Mobile H5: Safari iOS, Chrome Android (latest 2 versions). Minimum viewport width: 320px (iPhone SE).</w:t>
             </w:r>
           </w:p>
         </w:tc>

</xml_diff>